<commit_message>
Brochure pictures restored so the brochure rebuilds; strategy playbook marked INTERNAL; pack index header
</commit_message>
<xml_diff>
--- a/docs/package/01_Sales/iNXT_BrokerVerse_Competitive_Battlecard_INTERNAL.docx
+++ b/docs/package/01_Sales/iNXT_BrokerVerse_Competitive_Battlecard_INTERNAL.docx
@@ -789,7 +789,7 @@
             </w:rPr>
             <w:fldChar w:fldCharType="separate"/>
           </w:r>
-          <w:hyperlink w:anchor="__RefHeading___Toc16044_4049217194">
+          <w:hyperlink w:anchor="__RefHeading___Toc16044_3199679052">
             <w:r>
               <w:rPr>
                 <w:webHidden/>
@@ -824,7 +824,7 @@
             </w:tabs>
             <w:rPr/>
           </w:pPr>
-          <w:hyperlink w:anchor="__RefHeading___Toc16046_4049217194">
+          <w:hyperlink w:anchor="__RefHeading___Toc16046_3199679052">
             <w:r>
               <w:rPr>
                 <w:webHidden/>
@@ -853,7 +853,7 @@
             </w:tabs>
             <w:rPr/>
           </w:pPr>
-          <w:hyperlink w:anchor="__RefHeading___Toc16048_4049217194">
+          <w:hyperlink w:anchor="__RefHeading___Toc16048_3199679052">
             <w:r>
               <w:rPr>
                 <w:webHidden/>
@@ -875,7 +875,7 @@
             </w:tabs>
             <w:rPr/>
           </w:pPr>
-          <w:hyperlink w:anchor="__RefHeading___Toc16050_4049217194">
+          <w:hyperlink w:anchor="__RefHeading___Toc16050_3199679052">
             <w:r>
               <w:rPr>
                 <w:webHidden/>
@@ -897,7 +897,7 @@
             </w:tabs>
             <w:rPr/>
           </w:pPr>
-          <w:hyperlink w:anchor="__RefHeading___Toc16052_4049217194">
+          <w:hyperlink w:anchor="__RefHeading___Toc16052_3199679052">
             <w:r>
               <w:rPr>
                 <w:webHidden/>
@@ -919,7 +919,7 @@
             </w:tabs>
             <w:rPr/>
           </w:pPr>
-          <w:hyperlink w:anchor="__RefHeading___Toc16054_4049217194">
+          <w:hyperlink w:anchor="__RefHeading___Toc16054_3199679052">
             <w:r>
               <w:rPr>
                 <w:webHidden/>
@@ -941,7 +941,7 @@
             </w:tabs>
             <w:rPr/>
           </w:pPr>
-          <w:hyperlink w:anchor="__RefHeading___Toc16056_4049217194">
+          <w:hyperlink w:anchor="__RefHeading___Toc16056_3199679052">
             <w:r>
               <w:rPr>
                 <w:webHidden/>
@@ -963,7 +963,7 @@
             </w:tabs>
             <w:rPr/>
           </w:pPr>
-          <w:hyperlink w:anchor="__RefHeading___Toc16058_4049217194">
+          <w:hyperlink w:anchor="__RefHeading___Toc16058_3199679052">
             <w:r>
               <w:rPr>
                 <w:webHidden/>
@@ -985,7 +985,7 @@
             </w:tabs>
             <w:rPr/>
           </w:pPr>
-          <w:hyperlink w:anchor="__RefHeading___Toc16060_4049217194">
+          <w:hyperlink w:anchor="__RefHeading___Toc16060_3199679052">
             <w:r>
               <w:rPr>
                 <w:webHidden/>
@@ -1007,7 +1007,7 @@
             </w:tabs>
             <w:rPr/>
           </w:pPr>
-          <w:hyperlink w:anchor="__RefHeading___Toc16062_4049217194">
+          <w:hyperlink w:anchor="__RefHeading___Toc16062_3199679052">
             <w:r>
               <w:rPr>
                 <w:webHidden/>
@@ -1029,7 +1029,7 @@
             </w:tabs>
             <w:rPr/>
           </w:pPr>
-          <w:hyperlink w:anchor="__RefHeading___Toc16064_4049217194">
+          <w:hyperlink w:anchor="__RefHeading___Toc16064_3199679052">
             <w:r>
               <w:rPr>
                 <w:webHidden/>
@@ -1051,7 +1051,7 @@
             </w:tabs>
             <w:rPr/>
           </w:pPr>
-          <w:hyperlink w:anchor="__RefHeading___Toc16066_4049217194">
+          <w:hyperlink w:anchor="__RefHeading___Toc16066_3199679052">
             <w:r>
               <w:rPr>
                 <w:webHidden/>
@@ -1073,7 +1073,7 @@
             </w:tabs>
             <w:rPr/>
           </w:pPr>
-          <w:hyperlink w:anchor="__RefHeading___Toc16068_4049217194">
+          <w:hyperlink w:anchor="__RefHeading___Toc16068_3199679052">
             <w:r>
               <w:rPr>
                 <w:webHidden/>
@@ -1095,7 +1095,7 @@
             </w:tabs>
             <w:rPr/>
           </w:pPr>
-          <w:hyperlink w:anchor="__RefHeading___Toc16070_4049217194">
+          <w:hyperlink w:anchor="__RefHeading___Toc16070_3199679052">
             <w:r>
               <w:rPr>
                 <w:webHidden/>
@@ -1117,7 +1117,7 @@
             </w:tabs>
             <w:rPr/>
           </w:pPr>
-          <w:hyperlink w:anchor="__RefHeading___Toc16072_4049217194">
+          <w:hyperlink w:anchor="__RefHeading___Toc16072_3199679052">
             <w:r>
               <w:rPr>
                 <w:webHidden/>
@@ -1139,7 +1139,7 @@
             </w:tabs>
             <w:rPr/>
           </w:pPr>
-          <w:hyperlink w:anchor="__RefHeading___Toc16074_4049217194">
+          <w:hyperlink w:anchor="__RefHeading___Toc16074_3199679052">
             <w:r>
               <w:rPr>
                 <w:webHidden/>
@@ -1161,7 +1161,7 @@
             </w:tabs>
             <w:rPr/>
           </w:pPr>
-          <w:hyperlink w:anchor="__RefHeading___Toc16076_4049217194">
+          <w:hyperlink w:anchor="__RefHeading___Toc16076_3199679052">
             <w:r>
               <w:rPr>
                 <w:webHidden/>
@@ -1183,7 +1183,7 @@
             </w:tabs>
             <w:rPr/>
           </w:pPr>
-          <w:hyperlink w:anchor="__RefHeading___Toc16078_4049217194">
+          <w:hyperlink w:anchor="__RefHeading___Toc16078_3199679052">
             <w:r>
               <w:rPr>
                 <w:webHidden/>
@@ -1205,7 +1205,7 @@
             </w:tabs>
             <w:rPr/>
           </w:pPr>
-          <w:hyperlink w:anchor="__RefHeading___Toc16080_4049217194">
+          <w:hyperlink w:anchor="__RefHeading___Toc16080_3199679052">
             <w:r>
               <w:rPr>
                 <w:webHidden/>
@@ -1227,7 +1227,7 @@
             </w:tabs>
             <w:rPr/>
           </w:pPr>
-          <w:hyperlink w:anchor="__RefHeading___Toc16082_4049217194">
+          <w:hyperlink w:anchor="__RefHeading___Toc16082_3199679052">
             <w:r>
               <w:rPr>
                 <w:webHidden/>
@@ -1249,7 +1249,7 @@
             </w:tabs>
             <w:rPr/>
           </w:pPr>
-          <w:hyperlink w:anchor="__RefHeading___Toc16084_4049217194">
+          <w:hyperlink w:anchor="__RefHeading___Toc16084_3199679052">
             <w:r>
               <w:rPr>
                 <w:webHidden/>
@@ -1271,7 +1271,7 @@
             </w:tabs>
             <w:rPr/>
           </w:pPr>
-          <w:hyperlink w:anchor="__RefHeading___Toc16086_4049217194">
+          <w:hyperlink w:anchor="__RefHeading___Toc16086_3199679052">
             <w:r>
               <w:rPr>
                 <w:webHidden/>
@@ -1293,7 +1293,7 @@
             </w:tabs>
             <w:rPr/>
           </w:pPr>
-          <w:hyperlink w:anchor="__RefHeading___Toc16088_4049217194">
+          <w:hyperlink w:anchor="__RefHeading___Toc16088_3199679052">
             <w:r>
               <w:rPr>
                 <w:webHidden/>
@@ -1315,7 +1315,7 @@
             </w:tabs>
             <w:rPr/>
           </w:pPr>
-          <w:hyperlink w:anchor="__RefHeading___Toc16090_4049217194">
+          <w:hyperlink w:anchor="__RefHeading___Toc16090_3199679052">
             <w:r>
               <w:rPr>
                 <w:webHidden/>
@@ -1337,7 +1337,7 @@
             </w:tabs>
             <w:rPr/>
           </w:pPr>
-          <w:hyperlink w:anchor="__RefHeading___Toc16092_4049217194">
+          <w:hyperlink w:anchor="__RefHeading___Toc16092_3199679052">
             <w:r>
               <w:rPr>
                 <w:webHidden/>
@@ -1359,7 +1359,7 @@
             </w:tabs>
             <w:rPr/>
           </w:pPr>
-          <w:hyperlink w:anchor="__RefHeading___Toc16094_4049217194">
+          <w:hyperlink w:anchor="__RefHeading___Toc16094_3199679052">
             <w:r>
               <w:rPr>
                 <w:webHidden/>
@@ -1381,7 +1381,7 @@
             </w:tabs>
             <w:rPr/>
           </w:pPr>
-          <w:hyperlink w:anchor="__RefHeading___Toc16096_4049217194">
+          <w:hyperlink w:anchor="__RefHeading___Toc16096_3199679052">
             <w:r>
               <w:rPr>
                 <w:webHidden/>
@@ -1403,7 +1403,7 @@
             </w:tabs>
             <w:rPr/>
           </w:pPr>
-          <w:hyperlink w:anchor="__RefHeading___Toc16098_4049217194">
+          <w:hyperlink w:anchor="__RefHeading___Toc16098_3199679052">
             <w:r>
               <w:rPr>
                 <w:webHidden/>
@@ -1425,7 +1425,7 @@
             </w:tabs>
             <w:rPr/>
           </w:pPr>
-          <w:hyperlink w:anchor="__RefHeading___Toc16100_4049217194">
+          <w:hyperlink w:anchor="__RefHeading___Toc16100_3199679052">
             <w:r>
               <w:rPr>
                 <w:webHidden/>
@@ -1447,7 +1447,7 @@
             </w:tabs>
             <w:rPr/>
           </w:pPr>
-          <w:hyperlink w:anchor="__RefHeading___Toc16102_4049217194">
+          <w:hyperlink w:anchor="__RefHeading___Toc16102_3199679052">
             <w:r>
               <w:rPr>
                 <w:webHidden/>
@@ -1469,7 +1469,7 @@
             </w:tabs>
             <w:rPr/>
           </w:pPr>
-          <w:hyperlink w:anchor="__RefHeading___Toc16104_4049217194">
+          <w:hyperlink w:anchor="__RefHeading___Toc16104_3199679052">
             <w:r>
               <w:rPr>
                 <w:webHidden/>
@@ -1491,7 +1491,7 @@
             </w:tabs>
             <w:rPr/>
           </w:pPr>
-          <w:hyperlink w:anchor="__RefHeading___Toc16106_4049217194">
+          <w:hyperlink w:anchor="__RefHeading___Toc16106_3199679052">
             <w:r>
               <w:rPr>
                 <w:webHidden/>
@@ -1513,7 +1513,7 @@
             </w:tabs>
             <w:rPr/>
           </w:pPr>
-          <w:hyperlink w:anchor="__RefHeading___Toc16108_4049217194">
+          <w:hyperlink w:anchor="__RefHeading___Toc16108_3199679052">
             <w:r>
               <w:rPr>
                 <w:webHidden/>
@@ -1535,7 +1535,7 @@
             </w:tabs>
             <w:rPr/>
           </w:pPr>
-          <w:hyperlink w:anchor="__RefHeading___Toc16110_4049217194">
+          <w:hyperlink w:anchor="__RefHeading___Toc16110_3199679052">
             <w:r>
               <w:rPr>
                 <w:webHidden/>
@@ -1557,7 +1557,7 @@
             </w:tabs>
             <w:rPr/>
           </w:pPr>
-          <w:hyperlink w:anchor="__RefHeading___Toc16112_4049217194">
+          <w:hyperlink w:anchor="__RefHeading___Toc16112_3199679052">
             <w:r>
               <w:rPr>
                 <w:webHidden/>
@@ -1579,7 +1579,7 @@
             </w:tabs>
             <w:rPr/>
           </w:pPr>
-          <w:hyperlink w:anchor="__RefHeading___Toc16114_4049217194">
+          <w:hyperlink w:anchor="__RefHeading___Toc16114_3199679052">
             <w:r>
               <w:rPr>
                 <w:webHidden/>
@@ -1601,7 +1601,7 @@
             </w:tabs>
             <w:rPr/>
           </w:pPr>
-          <w:hyperlink w:anchor="__RefHeading___Toc16116_4049217194">
+          <w:hyperlink w:anchor="__RefHeading___Toc16116_3199679052">
             <w:r>
               <w:rPr>
                 <w:webHidden/>
@@ -1623,7 +1623,7 @@
             </w:tabs>
             <w:rPr/>
           </w:pPr>
-          <w:hyperlink w:anchor="__RefHeading___Toc16118_4049217194">
+          <w:hyperlink w:anchor="__RefHeading___Toc16118_3199679052">
             <w:r>
               <w:rPr>
                 <w:webHidden/>
@@ -1645,7 +1645,7 @@
             </w:tabs>
             <w:rPr/>
           </w:pPr>
-          <w:hyperlink w:anchor="__RefHeading___Toc16120_4049217194">
+          <w:hyperlink w:anchor="__RefHeading___Toc16120_3199679052">
             <w:r>
               <w:rPr>
                 <w:webHidden/>
@@ -1667,7 +1667,7 @@
             </w:tabs>
             <w:rPr/>
           </w:pPr>
-          <w:hyperlink w:anchor="__RefHeading___Toc16122_4049217194">
+          <w:hyperlink w:anchor="__RefHeading___Toc16122_3199679052">
             <w:r>
               <w:rPr>
                 <w:webHidden/>
@@ -1689,7 +1689,7 @@
             </w:tabs>
             <w:rPr/>
           </w:pPr>
-          <w:hyperlink w:anchor="__RefHeading___Toc16124_4049217194">
+          <w:hyperlink w:anchor="__RefHeading___Toc16124_3199679052">
             <w:r>
               <w:rPr>
                 <w:webHidden/>
@@ -1711,7 +1711,7 @@
             </w:tabs>
             <w:rPr/>
           </w:pPr>
-          <w:hyperlink w:anchor="__RefHeading___Toc16126_4049217194">
+          <w:hyperlink w:anchor="__RefHeading___Toc16126_3199679052">
             <w:r>
               <w:rPr>
                 <w:webHidden/>
@@ -1733,7 +1733,7 @@
             </w:tabs>
             <w:rPr/>
           </w:pPr>
-          <w:hyperlink w:anchor="__RefHeading___Toc16128_4049217194">
+          <w:hyperlink w:anchor="__RefHeading___Toc16128_3199679052">
             <w:r>
               <w:rPr>
                 <w:webHidden/>
@@ -1755,7 +1755,7 @@
             </w:tabs>
             <w:rPr/>
           </w:pPr>
-          <w:hyperlink w:anchor="__RefHeading___Toc16130_4049217194">
+          <w:hyperlink w:anchor="__RefHeading___Toc16130_3199679052">
             <w:r>
               <w:rPr>
                 <w:webHidden/>
@@ -1803,7 +1803,7 @@
       <w:r>
         <w:br w:type="page"/>
       </w:r>
-      <w:bookmarkStart w:id="0" w:name="__RefHeading___Toc16044_4049217194"/>
+      <w:bookmarkStart w:id="0" w:name="__RefHeading___Toc16044_3199679052"/>
       <w:bookmarkStart w:id="1" w:name="_Toc48319687"/>
       <w:bookmarkStart w:id="2" w:name="_Toc11824118"/>
       <w:bookmarkEnd w:id="0"/>
@@ -2448,7 +2448,7 @@
           <w:spacing w:val="0"/>
         </w:rPr>
       </w:pPr>
-      <w:bookmarkStart w:id="4" w:name="__RefHeading___Toc16046_4049217194"/>
+      <w:bookmarkStart w:id="4" w:name="__RefHeading___Toc16046_3199679052"/>
       <w:bookmarkStart w:id="5" w:name="_Toc233203388"/>
       <w:bookmarkEnd w:id="4"/>
       <w:r>
@@ -4306,7 +4306,7 @@
         <w:pageBreakBefore w:val="false"/>
         <w:rPr/>
       </w:pPr>
-      <w:bookmarkStart w:id="6" w:name="__RefHeading___Toc16048_4049217194"/>
+      <w:bookmarkStart w:id="6" w:name="__RefHeading___Toc16048_3199679052"/>
       <w:bookmarkEnd w:id="6"/>
       <w:r>
         <w:rPr>
@@ -4492,7 +4492,7 @@
         <w:pStyle w:val="Heading1"/>
         <w:rPr/>
       </w:pPr>
-      <w:bookmarkStart w:id="7" w:name="__RefHeading___Toc16050_4049217194"/>
+      <w:bookmarkStart w:id="7" w:name="__RefHeading___Toc16050_3199679052"/>
       <w:bookmarkEnd w:id="7"/>
       <w:r>
         <w:rPr>
@@ -4509,7 +4509,7 @@
         <w:pStyle w:val="Heading2"/>
         <w:rPr/>
       </w:pPr>
-      <w:bookmarkStart w:id="8" w:name="__RefHeading___Toc16052_4049217194"/>
+      <w:bookmarkStart w:id="8" w:name="__RefHeading___Toc16052_3199679052"/>
       <w:bookmarkEnd w:id="8"/>
       <w:r>
         <w:rPr>
@@ -4541,7 +4541,7 @@
         <w:pStyle w:val="Heading2"/>
         <w:rPr/>
       </w:pPr>
-      <w:bookmarkStart w:id="9" w:name="__RefHeading___Toc16054_4049217194"/>
+      <w:bookmarkStart w:id="9" w:name="__RefHeading___Toc16054_3199679052"/>
       <w:bookmarkEnd w:id="9"/>
       <w:r>
         <w:rPr>
@@ -4634,7 +4634,7 @@
         <w:pStyle w:val="Heading2"/>
         <w:rPr/>
       </w:pPr>
-      <w:bookmarkStart w:id="10" w:name="__RefHeading___Toc16056_4049217194"/>
+      <w:bookmarkStart w:id="10" w:name="__RefHeading___Toc16056_3199679052"/>
       <w:bookmarkEnd w:id="10"/>
       <w:r>
         <w:rPr>
@@ -4749,7 +4749,7 @@
         <w:pStyle w:val="Heading1"/>
         <w:rPr/>
       </w:pPr>
-      <w:bookmarkStart w:id="11" w:name="__RefHeading___Toc16058_4049217194"/>
+      <w:bookmarkStart w:id="11" w:name="__RefHeading___Toc16058_3199679052"/>
       <w:bookmarkEnd w:id="11"/>
       <w:r>
         <w:rPr>
@@ -4766,7 +4766,7 @@
         <w:pStyle w:val="Heading2"/>
         <w:rPr/>
       </w:pPr>
-      <w:bookmarkStart w:id="12" w:name="__RefHeading___Toc16060_4049217194"/>
+      <w:bookmarkStart w:id="12" w:name="__RefHeading___Toc16060_3199679052"/>
       <w:bookmarkEnd w:id="12"/>
       <w:r>
         <w:rPr>
@@ -4798,7 +4798,7 @@
         <w:pStyle w:val="Heading2"/>
         <w:rPr/>
       </w:pPr>
-      <w:bookmarkStart w:id="13" w:name="__RefHeading___Toc16062_4049217194"/>
+      <w:bookmarkStart w:id="13" w:name="__RefHeading___Toc16062_3199679052"/>
       <w:bookmarkEnd w:id="13"/>
       <w:r>
         <w:rPr>
@@ -4872,7 +4872,7 @@
         <w:pStyle w:val="Heading2"/>
         <w:rPr/>
       </w:pPr>
-      <w:bookmarkStart w:id="14" w:name="__RefHeading___Toc16064_4049217194"/>
+      <w:bookmarkStart w:id="14" w:name="__RefHeading___Toc16064_3199679052"/>
       <w:bookmarkEnd w:id="14"/>
       <w:r>
         <w:rPr>
@@ -4984,7 +4984,7 @@
         <w:pStyle w:val="Heading2"/>
         <w:rPr/>
       </w:pPr>
-      <w:bookmarkStart w:id="15" w:name="__RefHeading___Toc16066_4049217194"/>
+      <w:bookmarkStart w:id="15" w:name="__RefHeading___Toc16066_3199679052"/>
       <w:bookmarkEnd w:id="15"/>
       <w:r>
         <w:rPr>
@@ -5096,7 +5096,7 @@
         <w:pStyle w:val="Heading2"/>
         <w:rPr/>
       </w:pPr>
-      <w:bookmarkStart w:id="16" w:name="__RefHeading___Toc16068_4049217194"/>
+      <w:bookmarkStart w:id="16" w:name="__RefHeading___Toc16068_3199679052"/>
       <w:bookmarkEnd w:id="16"/>
       <w:r>
         <w:rPr>
@@ -5836,7 +5836,7 @@
         <w:pStyle w:val="Heading2"/>
         <w:rPr/>
       </w:pPr>
-      <w:bookmarkStart w:id="17" w:name="__RefHeading___Toc16070_4049217194"/>
+      <w:bookmarkStart w:id="17" w:name="__RefHeading___Toc16070_3199679052"/>
       <w:bookmarkEnd w:id="17"/>
       <w:r>
         <w:rPr>
@@ -5910,7 +5910,7 @@
         <w:pStyle w:val="Heading2"/>
         <w:rPr/>
       </w:pPr>
-      <w:bookmarkStart w:id="18" w:name="__RefHeading___Toc16072_4049217194"/>
+      <w:bookmarkStart w:id="18" w:name="__RefHeading___Toc16072_3199679052"/>
       <w:bookmarkEnd w:id="18"/>
       <w:r>
         <w:rPr>
@@ -5968,7 +5968,7 @@
         <w:pStyle w:val="Heading1"/>
         <w:rPr/>
       </w:pPr>
-      <w:bookmarkStart w:id="19" w:name="__RefHeading___Toc16074_4049217194"/>
+      <w:bookmarkStart w:id="19" w:name="__RefHeading___Toc16074_3199679052"/>
       <w:bookmarkEnd w:id="19"/>
       <w:r>
         <w:rPr>
@@ -5985,7 +5985,7 @@
         <w:pStyle w:val="Heading2"/>
         <w:rPr/>
       </w:pPr>
-      <w:bookmarkStart w:id="20" w:name="__RefHeading___Toc16076_4049217194"/>
+      <w:bookmarkStart w:id="20" w:name="__RefHeading___Toc16076_3199679052"/>
       <w:bookmarkEnd w:id="20"/>
       <w:r>
         <w:rPr>
@@ -6017,7 +6017,7 @@
         <w:pStyle w:val="Heading2"/>
         <w:rPr/>
       </w:pPr>
-      <w:bookmarkStart w:id="21" w:name="__RefHeading___Toc16078_4049217194"/>
+      <w:bookmarkStart w:id="21" w:name="__RefHeading___Toc16078_3199679052"/>
       <w:bookmarkEnd w:id="21"/>
       <w:r>
         <w:rPr>
@@ -6072,7 +6072,7 @@
         <w:pStyle w:val="Heading2"/>
         <w:rPr/>
       </w:pPr>
-      <w:bookmarkStart w:id="22" w:name="__RefHeading___Toc16080_4049217194"/>
+      <w:bookmarkStart w:id="22" w:name="__RefHeading___Toc16080_3199679052"/>
       <w:bookmarkEnd w:id="22"/>
       <w:r>
         <w:rPr>
@@ -6165,7 +6165,7 @@
         <w:pStyle w:val="Heading2"/>
         <w:rPr/>
       </w:pPr>
-      <w:bookmarkStart w:id="23" w:name="__RefHeading___Toc16082_4049217194"/>
+      <w:bookmarkStart w:id="23" w:name="__RefHeading___Toc16082_3199679052"/>
       <w:bookmarkEnd w:id="23"/>
       <w:r>
         <w:rPr>
@@ -6258,7 +6258,7 @@
         <w:pStyle w:val="Heading2"/>
         <w:rPr/>
       </w:pPr>
-      <w:bookmarkStart w:id="24" w:name="__RefHeading___Toc16084_4049217194"/>
+      <w:bookmarkStart w:id="24" w:name="__RefHeading___Toc16084_3199679052"/>
       <w:bookmarkEnd w:id="24"/>
       <w:r>
         <w:rPr>
@@ -6884,7 +6884,7 @@
         <w:pStyle w:val="Heading2"/>
         <w:rPr/>
       </w:pPr>
-      <w:bookmarkStart w:id="25" w:name="__RefHeading___Toc16086_4049217194"/>
+      <w:bookmarkStart w:id="25" w:name="__RefHeading___Toc16086_3199679052"/>
       <w:bookmarkEnd w:id="25"/>
       <w:r>
         <w:rPr>
@@ -6939,7 +6939,7 @@
         <w:pStyle w:val="Heading2"/>
         <w:rPr/>
       </w:pPr>
-      <w:bookmarkStart w:id="26" w:name="__RefHeading___Toc16088_4049217194"/>
+      <w:bookmarkStart w:id="26" w:name="__RefHeading___Toc16088_3199679052"/>
       <w:bookmarkEnd w:id="26"/>
       <w:r>
         <w:rPr>
@@ -6997,7 +6997,7 @@
         <w:pStyle w:val="Heading1"/>
         <w:rPr/>
       </w:pPr>
-      <w:bookmarkStart w:id="27" w:name="__RefHeading___Toc16090_4049217194"/>
+      <w:bookmarkStart w:id="27" w:name="__RefHeading___Toc16090_3199679052"/>
       <w:bookmarkEnd w:id="27"/>
       <w:r>
         <w:rPr>
@@ -7014,7 +7014,7 @@
         <w:pStyle w:val="Heading2"/>
         <w:rPr/>
       </w:pPr>
-      <w:bookmarkStart w:id="28" w:name="__RefHeading___Toc16092_4049217194"/>
+      <w:bookmarkStart w:id="28" w:name="__RefHeading___Toc16092_3199679052"/>
       <w:bookmarkEnd w:id="28"/>
       <w:r>
         <w:rPr>
@@ -7046,7 +7046,7 @@
         <w:pStyle w:val="Heading2"/>
         <w:rPr/>
       </w:pPr>
-      <w:bookmarkStart w:id="29" w:name="__RefHeading___Toc16094_4049217194"/>
+      <w:bookmarkStart w:id="29" w:name="__RefHeading___Toc16094_3199679052"/>
       <w:bookmarkEnd w:id="29"/>
       <w:r>
         <w:rPr>
@@ -7120,7 +7120,7 @@
         <w:pStyle w:val="Heading2"/>
         <w:rPr/>
       </w:pPr>
-      <w:bookmarkStart w:id="30" w:name="__RefHeading___Toc16096_4049217194"/>
+      <w:bookmarkStart w:id="30" w:name="__RefHeading___Toc16096_3199679052"/>
       <w:bookmarkEnd w:id="30"/>
       <w:r>
         <w:rPr>
@@ -7804,7 +7804,7 @@
         <w:pStyle w:val="Heading2"/>
         <w:rPr/>
       </w:pPr>
-      <w:bookmarkStart w:id="31" w:name="__RefHeading___Toc16098_4049217194"/>
+      <w:bookmarkStart w:id="31" w:name="__RefHeading___Toc16098_3199679052"/>
       <w:bookmarkEnd w:id="31"/>
       <w:r>
         <w:rPr>
@@ -7897,7 +7897,7 @@
         <w:pStyle w:val="Heading2"/>
         <w:rPr/>
       </w:pPr>
-      <w:bookmarkStart w:id="32" w:name="__RefHeading___Toc16100_4049217194"/>
+      <w:bookmarkStart w:id="32" w:name="__RefHeading___Toc16100_3199679052"/>
       <w:bookmarkEnd w:id="32"/>
       <w:r>
         <w:rPr>
@@ -8523,7 +8523,7 @@
         <w:pStyle w:val="Heading2"/>
         <w:rPr/>
       </w:pPr>
-      <w:bookmarkStart w:id="33" w:name="__RefHeading___Toc16102_4049217194"/>
+      <w:bookmarkStart w:id="33" w:name="__RefHeading___Toc16102_3199679052"/>
       <w:bookmarkEnd w:id="33"/>
       <w:r>
         <w:rPr>
@@ -8597,7 +8597,7 @@
         <w:pStyle w:val="Heading2"/>
         <w:rPr/>
       </w:pPr>
-      <w:bookmarkStart w:id="34" w:name="__RefHeading___Toc16104_4049217194"/>
+      <w:bookmarkStart w:id="34" w:name="__RefHeading___Toc16104_3199679052"/>
       <w:bookmarkEnd w:id="34"/>
       <w:r>
         <w:rPr>
@@ -8672,7 +8672,7 @@
         <w:pStyle w:val="Heading1"/>
         <w:rPr/>
       </w:pPr>
-      <w:bookmarkStart w:id="35" w:name="__RefHeading___Toc16106_4049217194"/>
+      <w:bookmarkStart w:id="35" w:name="__RefHeading___Toc16106_3199679052"/>
       <w:bookmarkEnd w:id="35"/>
       <w:r>
         <w:rPr>
@@ -8689,7 +8689,7 @@
         <w:pStyle w:val="Heading2"/>
         <w:rPr/>
       </w:pPr>
-      <w:bookmarkStart w:id="36" w:name="__RefHeading___Toc16108_4049217194"/>
+      <w:bookmarkStart w:id="36" w:name="__RefHeading___Toc16108_3199679052"/>
       <w:bookmarkEnd w:id="36"/>
       <w:r>
         <w:rPr>
@@ -8721,7 +8721,7 @@
         <w:pStyle w:val="Heading2"/>
         <w:rPr/>
       </w:pPr>
-      <w:bookmarkStart w:id="37" w:name="__RefHeading___Toc16110_4049217194"/>
+      <w:bookmarkStart w:id="37" w:name="__RefHeading___Toc16110_3199679052"/>
       <w:bookmarkEnd w:id="37"/>
       <w:r>
         <w:rPr>
@@ -8795,7 +8795,7 @@
         <w:pStyle w:val="Heading2"/>
         <w:rPr/>
       </w:pPr>
-      <w:bookmarkStart w:id="38" w:name="__RefHeading___Toc16112_4049217194"/>
+      <w:bookmarkStart w:id="38" w:name="__RefHeading___Toc16112_3199679052"/>
       <w:bookmarkEnd w:id="38"/>
       <w:r>
         <w:rPr>
@@ -8888,7 +8888,7 @@
         <w:pStyle w:val="Heading2"/>
         <w:rPr/>
       </w:pPr>
-      <w:bookmarkStart w:id="39" w:name="__RefHeading___Toc16114_4049217194"/>
+      <w:bookmarkStart w:id="39" w:name="__RefHeading___Toc16114_3199679052"/>
       <w:bookmarkEnd w:id="39"/>
       <w:r>
         <w:rPr>
@@ -8981,7 +8981,7 @@
         <w:pStyle w:val="Heading2"/>
         <w:rPr/>
       </w:pPr>
-      <w:bookmarkStart w:id="40" w:name="__RefHeading___Toc16116_4049217194"/>
+      <w:bookmarkStart w:id="40" w:name="__RefHeading___Toc16116_3199679052"/>
       <w:bookmarkEnd w:id="40"/>
       <w:r>
         <w:rPr>
@@ -9607,7 +9607,7 @@
         <w:pStyle w:val="Heading2"/>
         <w:rPr/>
       </w:pPr>
-      <w:bookmarkStart w:id="41" w:name="__RefHeading___Toc16118_4049217194"/>
+      <w:bookmarkStart w:id="41" w:name="__RefHeading___Toc16118_3199679052"/>
       <w:bookmarkEnd w:id="41"/>
       <w:r>
         <w:rPr>
@@ -9681,7 +9681,7 @@
         <w:pStyle w:val="Heading2"/>
         <w:rPr/>
       </w:pPr>
-      <w:bookmarkStart w:id="42" w:name="__RefHeading___Toc16120_4049217194"/>
+      <w:bookmarkStart w:id="42" w:name="__RefHeading___Toc16120_3199679052"/>
       <w:bookmarkEnd w:id="42"/>
       <w:r>
         <w:rPr>
@@ -9720,7 +9720,7 @@
         <w:pStyle w:val="Heading1"/>
         <w:rPr/>
       </w:pPr>
-      <w:bookmarkStart w:id="43" w:name="__RefHeading___Toc16122_4049217194"/>
+      <w:bookmarkStart w:id="43" w:name="__RefHeading___Toc16122_3199679052"/>
       <w:bookmarkEnd w:id="43"/>
       <w:r>
         <w:rPr>
@@ -10339,7 +10339,7 @@
       <w:r>
         <w:br w:type="page"/>
       </w:r>
-      <w:bookmarkStart w:id="44" w:name="__RefHeading___Toc16124_4049217194"/>
+      <w:bookmarkStart w:id="44" w:name="__RefHeading___Toc16124_3199679052"/>
       <w:bookmarkEnd w:id="44"/>
       <w:r>
         <w:rPr>
@@ -11072,7 +11072,7 @@
       <w:r>
         <w:br w:type="page"/>
       </w:r>
-      <w:bookmarkStart w:id="45" w:name="__RefHeading___Toc16126_4049217194"/>
+      <w:bookmarkStart w:id="45" w:name="__RefHeading___Toc16126_3199679052"/>
       <w:bookmarkEnd w:id="45"/>
       <w:r>
         <w:rPr>
@@ -11734,7 +11734,7 @@
       <w:r>
         <w:br w:type="page"/>
       </w:r>
-      <w:bookmarkStart w:id="46" w:name="__RefHeading___Toc16128_4049217194"/>
+      <w:bookmarkStart w:id="46" w:name="__RefHeading___Toc16128_3199679052"/>
       <w:bookmarkEnd w:id="46"/>
       <w:r>
         <w:rPr>
@@ -11783,7 +11783,7 @@
           <w:spacing w:val="0"/>
         </w:rPr>
       </w:pPr>
-      <w:bookmarkStart w:id="47" w:name="__RefHeading___Toc16130_4049217194"/>
+      <w:bookmarkStart w:id="47" w:name="__RefHeading___Toc16130_3199679052"/>
       <w:bookmarkStart w:id="48" w:name="_Toc233203395"/>
       <w:bookmarkEnd w:id="47"/>
       <w:r>

</xml_diff>

<commit_message>
Documentation pack: release figures aligned with the release verification of 04 October 2026 (UAT 433 steps, rehearsal 52 checks, 1,113 backend and 175 front-end tests, 629 test cases, migrations to 0331, 8 roles, 74 upload templates, user manual 1.2); packages B and G recorded as merged; 15 documents rebuilt
</commit_message>
<xml_diff>
--- a/docs/package/01_Sales/iNXT_BrokerVerse_Competitive_Battlecard_INTERNAL.docx
+++ b/docs/package/01_Sales/iNXT_BrokerVerse_Competitive_Battlecard_INTERNAL.docx
@@ -789,7 +789,7 @@
             </w:rPr>
             <w:fldChar w:fldCharType="separate"/>
           </w:r>
-          <w:hyperlink w:anchor="__RefHeading___Toc8886_1360963153">
+          <w:hyperlink w:anchor="__RefHeading___Toc1980_2241325158">
             <w:r>
               <w:rPr>
                 <w:webHidden/>
@@ -824,7 +824,7 @@
             </w:tabs>
             <w:rPr/>
           </w:pPr>
-          <w:hyperlink w:anchor="__RefHeading___Toc8888_1360963153">
+          <w:hyperlink w:anchor="__RefHeading___Toc1982_2241325158">
             <w:r>
               <w:rPr>
                 <w:webHidden/>
@@ -853,7 +853,7 @@
             </w:tabs>
             <w:rPr/>
           </w:pPr>
-          <w:hyperlink w:anchor="__RefHeading___Toc8890_1360963153">
+          <w:hyperlink w:anchor="__RefHeading___Toc1984_2241325158">
             <w:r>
               <w:rPr>
                 <w:webHidden/>
@@ -875,7 +875,7 @@
             </w:tabs>
             <w:rPr/>
           </w:pPr>
-          <w:hyperlink w:anchor="__RefHeading___Toc8892_1360963153">
+          <w:hyperlink w:anchor="__RefHeading___Toc1986_2241325158">
             <w:r>
               <w:rPr>
                 <w:webHidden/>
@@ -897,7 +897,7 @@
             </w:tabs>
             <w:rPr/>
           </w:pPr>
-          <w:hyperlink w:anchor="__RefHeading___Toc8894_1360963153">
+          <w:hyperlink w:anchor="__RefHeading___Toc1988_2241325158">
             <w:r>
               <w:rPr>
                 <w:webHidden/>
@@ -919,7 +919,7 @@
             </w:tabs>
             <w:rPr/>
           </w:pPr>
-          <w:hyperlink w:anchor="__RefHeading___Toc8896_1360963153">
+          <w:hyperlink w:anchor="__RefHeading___Toc1990_2241325158">
             <w:r>
               <w:rPr>
                 <w:webHidden/>
@@ -941,7 +941,7 @@
             </w:tabs>
             <w:rPr/>
           </w:pPr>
-          <w:hyperlink w:anchor="__RefHeading___Toc8898_1360963153">
+          <w:hyperlink w:anchor="__RefHeading___Toc1992_2241325158">
             <w:r>
               <w:rPr>
                 <w:webHidden/>
@@ -963,7 +963,7 @@
             </w:tabs>
             <w:rPr/>
           </w:pPr>
-          <w:hyperlink w:anchor="__RefHeading___Toc8900_1360963153">
+          <w:hyperlink w:anchor="__RefHeading___Toc1994_2241325158">
             <w:r>
               <w:rPr>
                 <w:webHidden/>
@@ -985,7 +985,7 @@
             </w:tabs>
             <w:rPr/>
           </w:pPr>
-          <w:hyperlink w:anchor="__RefHeading___Toc8902_1360963153">
+          <w:hyperlink w:anchor="__RefHeading___Toc1996_2241325158">
             <w:r>
               <w:rPr>
                 <w:webHidden/>
@@ -1007,7 +1007,7 @@
             </w:tabs>
             <w:rPr/>
           </w:pPr>
-          <w:hyperlink w:anchor="__RefHeading___Toc8904_1360963153">
+          <w:hyperlink w:anchor="__RefHeading___Toc1998_2241325158">
             <w:r>
               <w:rPr>
                 <w:webHidden/>
@@ -1029,7 +1029,7 @@
             </w:tabs>
             <w:rPr/>
           </w:pPr>
-          <w:hyperlink w:anchor="__RefHeading___Toc8906_1360963153">
+          <w:hyperlink w:anchor="__RefHeading___Toc2000_2241325158">
             <w:r>
               <w:rPr>
                 <w:webHidden/>
@@ -1051,7 +1051,7 @@
             </w:tabs>
             <w:rPr/>
           </w:pPr>
-          <w:hyperlink w:anchor="__RefHeading___Toc8908_1360963153">
+          <w:hyperlink w:anchor="__RefHeading___Toc2002_2241325158">
             <w:r>
               <w:rPr>
                 <w:webHidden/>
@@ -1073,7 +1073,7 @@
             </w:tabs>
             <w:rPr/>
           </w:pPr>
-          <w:hyperlink w:anchor="__RefHeading___Toc8910_1360963153">
+          <w:hyperlink w:anchor="__RefHeading___Toc2004_2241325158">
             <w:r>
               <w:rPr>
                 <w:webHidden/>
@@ -1095,7 +1095,7 @@
             </w:tabs>
             <w:rPr/>
           </w:pPr>
-          <w:hyperlink w:anchor="__RefHeading___Toc8912_1360963153">
+          <w:hyperlink w:anchor="__RefHeading___Toc2006_2241325158">
             <w:r>
               <w:rPr>
                 <w:webHidden/>
@@ -1117,7 +1117,7 @@
             </w:tabs>
             <w:rPr/>
           </w:pPr>
-          <w:hyperlink w:anchor="__RefHeading___Toc8914_1360963153">
+          <w:hyperlink w:anchor="__RefHeading___Toc2008_2241325158">
             <w:r>
               <w:rPr>
                 <w:webHidden/>
@@ -1139,7 +1139,7 @@
             </w:tabs>
             <w:rPr/>
           </w:pPr>
-          <w:hyperlink w:anchor="__RefHeading___Toc8916_1360963153">
+          <w:hyperlink w:anchor="__RefHeading___Toc2010_2241325158">
             <w:r>
               <w:rPr>
                 <w:webHidden/>
@@ -1161,7 +1161,7 @@
             </w:tabs>
             <w:rPr/>
           </w:pPr>
-          <w:hyperlink w:anchor="__RefHeading___Toc8918_1360963153">
+          <w:hyperlink w:anchor="__RefHeading___Toc2012_2241325158">
             <w:r>
               <w:rPr>
                 <w:webHidden/>
@@ -1183,7 +1183,7 @@
             </w:tabs>
             <w:rPr/>
           </w:pPr>
-          <w:hyperlink w:anchor="__RefHeading___Toc8920_1360963153">
+          <w:hyperlink w:anchor="__RefHeading___Toc2014_2241325158">
             <w:r>
               <w:rPr>
                 <w:webHidden/>
@@ -1205,7 +1205,7 @@
             </w:tabs>
             <w:rPr/>
           </w:pPr>
-          <w:hyperlink w:anchor="__RefHeading___Toc8922_1360963153">
+          <w:hyperlink w:anchor="__RefHeading___Toc2016_2241325158">
             <w:r>
               <w:rPr>
                 <w:webHidden/>
@@ -1227,7 +1227,7 @@
             </w:tabs>
             <w:rPr/>
           </w:pPr>
-          <w:hyperlink w:anchor="__RefHeading___Toc8924_1360963153">
+          <w:hyperlink w:anchor="__RefHeading___Toc2018_2241325158">
             <w:r>
               <w:rPr>
                 <w:webHidden/>
@@ -1249,7 +1249,7 @@
             </w:tabs>
             <w:rPr/>
           </w:pPr>
-          <w:hyperlink w:anchor="__RefHeading___Toc8926_1360963153">
+          <w:hyperlink w:anchor="__RefHeading___Toc2020_2241325158">
             <w:r>
               <w:rPr>
                 <w:webHidden/>
@@ -1271,7 +1271,7 @@
             </w:tabs>
             <w:rPr/>
           </w:pPr>
-          <w:hyperlink w:anchor="__RefHeading___Toc8928_1360963153">
+          <w:hyperlink w:anchor="__RefHeading___Toc2022_2241325158">
             <w:r>
               <w:rPr>
                 <w:webHidden/>
@@ -1293,7 +1293,7 @@
             </w:tabs>
             <w:rPr/>
           </w:pPr>
-          <w:hyperlink w:anchor="__RefHeading___Toc8930_1360963153">
+          <w:hyperlink w:anchor="__RefHeading___Toc2024_2241325158">
             <w:r>
               <w:rPr>
                 <w:webHidden/>
@@ -1315,7 +1315,7 @@
             </w:tabs>
             <w:rPr/>
           </w:pPr>
-          <w:hyperlink w:anchor="__RefHeading___Toc8932_1360963153">
+          <w:hyperlink w:anchor="__RefHeading___Toc2026_2241325158">
             <w:r>
               <w:rPr>
                 <w:webHidden/>
@@ -1337,7 +1337,7 @@
             </w:tabs>
             <w:rPr/>
           </w:pPr>
-          <w:hyperlink w:anchor="__RefHeading___Toc8934_1360963153">
+          <w:hyperlink w:anchor="__RefHeading___Toc2028_2241325158">
             <w:r>
               <w:rPr>
                 <w:webHidden/>
@@ -1359,7 +1359,7 @@
             </w:tabs>
             <w:rPr/>
           </w:pPr>
-          <w:hyperlink w:anchor="__RefHeading___Toc8936_1360963153">
+          <w:hyperlink w:anchor="__RefHeading___Toc2030_2241325158">
             <w:r>
               <w:rPr>
                 <w:webHidden/>
@@ -1381,7 +1381,7 @@
             </w:tabs>
             <w:rPr/>
           </w:pPr>
-          <w:hyperlink w:anchor="__RefHeading___Toc8938_1360963153">
+          <w:hyperlink w:anchor="__RefHeading___Toc2032_2241325158">
             <w:r>
               <w:rPr>
                 <w:webHidden/>
@@ -1403,7 +1403,7 @@
             </w:tabs>
             <w:rPr/>
           </w:pPr>
-          <w:hyperlink w:anchor="__RefHeading___Toc8940_1360963153">
+          <w:hyperlink w:anchor="__RefHeading___Toc2034_2241325158">
             <w:r>
               <w:rPr>
                 <w:webHidden/>
@@ -1425,7 +1425,7 @@
             </w:tabs>
             <w:rPr/>
           </w:pPr>
-          <w:hyperlink w:anchor="__RefHeading___Toc8942_1360963153">
+          <w:hyperlink w:anchor="__RefHeading___Toc2036_2241325158">
             <w:r>
               <w:rPr>
                 <w:webHidden/>
@@ -1447,7 +1447,7 @@
             </w:tabs>
             <w:rPr/>
           </w:pPr>
-          <w:hyperlink w:anchor="__RefHeading___Toc8944_1360963153">
+          <w:hyperlink w:anchor="__RefHeading___Toc2038_2241325158">
             <w:r>
               <w:rPr>
                 <w:webHidden/>
@@ -1469,7 +1469,7 @@
             </w:tabs>
             <w:rPr/>
           </w:pPr>
-          <w:hyperlink w:anchor="__RefHeading___Toc8946_1360963153">
+          <w:hyperlink w:anchor="__RefHeading___Toc2040_2241325158">
             <w:r>
               <w:rPr>
                 <w:webHidden/>
@@ -1491,7 +1491,7 @@
             </w:tabs>
             <w:rPr/>
           </w:pPr>
-          <w:hyperlink w:anchor="__RefHeading___Toc8948_1360963153">
+          <w:hyperlink w:anchor="__RefHeading___Toc2042_2241325158">
             <w:r>
               <w:rPr>
                 <w:webHidden/>
@@ -1513,7 +1513,7 @@
             </w:tabs>
             <w:rPr/>
           </w:pPr>
-          <w:hyperlink w:anchor="__RefHeading___Toc8950_1360963153">
+          <w:hyperlink w:anchor="__RefHeading___Toc2044_2241325158">
             <w:r>
               <w:rPr>
                 <w:webHidden/>
@@ -1535,7 +1535,7 @@
             </w:tabs>
             <w:rPr/>
           </w:pPr>
-          <w:hyperlink w:anchor="__RefHeading___Toc8952_1360963153">
+          <w:hyperlink w:anchor="__RefHeading___Toc2046_2241325158">
             <w:r>
               <w:rPr>
                 <w:webHidden/>
@@ -1557,7 +1557,7 @@
             </w:tabs>
             <w:rPr/>
           </w:pPr>
-          <w:hyperlink w:anchor="__RefHeading___Toc8954_1360963153">
+          <w:hyperlink w:anchor="__RefHeading___Toc2048_2241325158">
             <w:r>
               <w:rPr>
                 <w:webHidden/>
@@ -1579,7 +1579,7 @@
             </w:tabs>
             <w:rPr/>
           </w:pPr>
-          <w:hyperlink w:anchor="__RefHeading___Toc8956_1360963153">
+          <w:hyperlink w:anchor="__RefHeading___Toc2050_2241325158">
             <w:r>
               <w:rPr>
                 <w:webHidden/>
@@ -1601,7 +1601,7 @@
             </w:tabs>
             <w:rPr/>
           </w:pPr>
-          <w:hyperlink w:anchor="__RefHeading___Toc8958_1360963153">
+          <w:hyperlink w:anchor="__RefHeading___Toc2052_2241325158">
             <w:r>
               <w:rPr>
                 <w:webHidden/>
@@ -1623,7 +1623,7 @@
             </w:tabs>
             <w:rPr/>
           </w:pPr>
-          <w:hyperlink w:anchor="__RefHeading___Toc8960_1360963153">
+          <w:hyperlink w:anchor="__RefHeading___Toc2054_2241325158">
             <w:r>
               <w:rPr>
                 <w:webHidden/>
@@ -1645,7 +1645,7 @@
             </w:tabs>
             <w:rPr/>
           </w:pPr>
-          <w:hyperlink w:anchor="__RefHeading___Toc8962_1360963153">
+          <w:hyperlink w:anchor="__RefHeading___Toc2056_2241325158">
             <w:r>
               <w:rPr>
                 <w:webHidden/>
@@ -1667,7 +1667,7 @@
             </w:tabs>
             <w:rPr/>
           </w:pPr>
-          <w:hyperlink w:anchor="__RefHeading___Toc8964_1360963153">
+          <w:hyperlink w:anchor="__RefHeading___Toc2058_2241325158">
             <w:r>
               <w:rPr>
                 <w:webHidden/>
@@ -1689,7 +1689,7 @@
             </w:tabs>
             <w:rPr/>
           </w:pPr>
-          <w:hyperlink w:anchor="__RefHeading___Toc8966_1360963153">
+          <w:hyperlink w:anchor="__RefHeading___Toc2060_2241325158">
             <w:r>
               <w:rPr>
                 <w:webHidden/>
@@ -1711,7 +1711,7 @@
             </w:tabs>
             <w:rPr/>
           </w:pPr>
-          <w:hyperlink w:anchor="__RefHeading___Toc8968_1360963153">
+          <w:hyperlink w:anchor="__RefHeading___Toc2062_2241325158">
             <w:r>
               <w:rPr>
                 <w:webHidden/>
@@ -1733,7 +1733,7 @@
             </w:tabs>
             <w:rPr/>
           </w:pPr>
-          <w:hyperlink w:anchor="__RefHeading___Toc8970_1360963153">
+          <w:hyperlink w:anchor="__RefHeading___Toc2064_2241325158">
             <w:r>
               <w:rPr>
                 <w:webHidden/>
@@ -1755,7 +1755,7 @@
             </w:tabs>
             <w:rPr/>
           </w:pPr>
-          <w:hyperlink w:anchor="__RefHeading___Toc8972_1360963153">
+          <w:hyperlink w:anchor="__RefHeading___Toc2066_2241325158">
             <w:r>
               <w:rPr>
                 <w:webHidden/>
@@ -1803,7 +1803,7 @@
       <w:r>
         <w:br w:type="page"/>
       </w:r>
-      <w:bookmarkStart w:id="0" w:name="__RefHeading___Toc8886_1360963153"/>
+      <w:bookmarkStart w:id="0" w:name="__RefHeading___Toc1980_2241325158"/>
       <w:bookmarkStart w:id="1" w:name="_Toc48319687"/>
       <w:bookmarkStart w:id="2" w:name="_Toc11824118"/>
       <w:bookmarkEnd w:id="0"/>
@@ -2197,7 +2197,7 @@
                 <w:szCs w:val="24"/>
                 <w:lang w:val="en-US" w:eastAsia="ja-JP" w:bidi="ar-SA"/>
               </w:rPr>
-              <w:t>1.1</w:t>
+              <w:t>1.1.1</w:t>
             </w:r>
           </w:p>
         </w:tc>
@@ -2345,7 +2345,7 @@
                 <w:szCs w:val="24"/>
                 <w:lang w:val="en-US" w:eastAsia="ja-JP" w:bidi="ar-SA"/>
               </w:rPr>
-              <w:t>Position, proof points and limits updated for AML/CFT, the IC and NPC registers, BIR forms and EOPT, integrations, dealer programmes, branding, My Work and the Report Builder</w:t>
+              <w:t>Version 1.1.1: release figures aligned with the release verification of 04 October 2026 (proof points). Version 1.1: position, proof points and limits updated for AML/CFT, the IC and NPC registers, BIR forms and EOPT, integrations, dealer programmes, branding, My Work and the Report Builder</w:t>
             </w:r>
           </w:p>
         </w:tc>
@@ -2448,7 +2448,7 @@
           <w:spacing w:val="0"/>
         </w:rPr>
       </w:pPr>
-      <w:bookmarkStart w:id="4" w:name="__RefHeading___Toc8888_1360963153"/>
+      <w:bookmarkStart w:id="4" w:name="__RefHeading___Toc1982_2241325158"/>
       <w:bookmarkStart w:id="5" w:name="_Toc233203388"/>
       <w:bookmarkEnd w:id="4"/>
       <w:r>
@@ -4701,7 +4701,7 @@
         <w:pageBreakBefore w:val="false"/>
         <w:rPr/>
       </w:pPr>
-      <w:bookmarkStart w:id="6" w:name="__RefHeading___Toc8890_1360963153"/>
+      <w:bookmarkStart w:id="6" w:name="__RefHeading___Toc1984_2241325158"/>
       <w:bookmarkEnd w:id="6"/>
       <w:r>
         <w:rPr>
@@ -4887,7 +4887,7 @@
         <w:pStyle w:val="Heading1"/>
         <w:rPr/>
       </w:pPr>
-      <w:bookmarkStart w:id="7" w:name="__RefHeading___Toc8892_1360963153"/>
+      <w:bookmarkStart w:id="7" w:name="__RefHeading___Toc1986_2241325158"/>
       <w:bookmarkEnd w:id="7"/>
       <w:r>
         <w:rPr>
@@ -4904,7 +4904,7 @@
         <w:pStyle w:val="Heading2"/>
         <w:rPr/>
       </w:pPr>
-      <w:bookmarkStart w:id="8" w:name="__RefHeading___Toc8894_1360963153"/>
+      <w:bookmarkStart w:id="8" w:name="__RefHeading___Toc1988_2241325158"/>
       <w:bookmarkEnd w:id="8"/>
       <w:r>
         <w:rPr>
@@ -4936,7 +4936,7 @@
         <w:pStyle w:val="Heading2"/>
         <w:rPr/>
       </w:pPr>
-      <w:bookmarkStart w:id="9" w:name="__RefHeading___Toc8896_1360963153"/>
+      <w:bookmarkStart w:id="9" w:name="__RefHeading___Toc1990_2241325158"/>
       <w:bookmarkEnd w:id="9"/>
       <w:r>
         <w:rPr>
@@ -5067,7 +5067,7 @@
         <w:pStyle w:val="Heading2"/>
         <w:rPr/>
       </w:pPr>
-      <w:bookmarkStart w:id="10" w:name="__RefHeading___Toc8898_1360963153"/>
+      <w:bookmarkStart w:id="10" w:name="__RefHeading___Toc1992_2241325158"/>
       <w:bookmarkEnd w:id="10"/>
       <w:r>
         <w:rPr>
@@ -5182,7 +5182,7 @@
         <w:pStyle w:val="Heading1"/>
         <w:rPr/>
       </w:pPr>
-      <w:bookmarkStart w:id="11" w:name="__RefHeading___Toc8900_1360963153"/>
+      <w:bookmarkStart w:id="11" w:name="__RefHeading___Toc1994_2241325158"/>
       <w:bookmarkEnd w:id="11"/>
       <w:r>
         <w:rPr>
@@ -5199,7 +5199,7 @@
         <w:pStyle w:val="Heading2"/>
         <w:rPr/>
       </w:pPr>
-      <w:bookmarkStart w:id="12" w:name="__RefHeading___Toc8902_1360963153"/>
+      <w:bookmarkStart w:id="12" w:name="__RefHeading___Toc1996_2241325158"/>
       <w:bookmarkEnd w:id="12"/>
       <w:r>
         <w:rPr>
@@ -5231,7 +5231,7 @@
         <w:pStyle w:val="Heading2"/>
         <w:rPr/>
       </w:pPr>
-      <w:bookmarkStart w:id="13" w:name="__RefHeading___Toc8904_1360963153"/>
+      <w:bookmarkStart w:id="13" w:name="__RefHeading___Toc1998_2241325158"/>
       <w:bookmarkEnd w:id="13"/>
       <w:r>
         <w:rPr>
@@ -5305,7 +5305,7 @@
         <w:pStyle w:val="Heading2"/>
         <w:rPr/>
       </w:pPr>
-      <w:bookmarkStart w:id="14" w:name="__RefHeading___Toc8906_1360963153"/>
+      <w:bookmarkStart w:id="14" w:name="__RefHeading___Toc2000_2241325158"/>
       <w:bookmarkEnd w:id="14"/>
       <w:r>
         <w:rPr>
@@ -5417,7 +5417,7 @@
         <w:pStyle w:val="Heading2"/>
         <w:rPr/>
       </w:pPr>
-      <w:bookmarkStart w:id="15" w:name="__RefHeading___Toc8908_1360963153"/>
+      <w:bookmarkStart w:id="15" w:name="__RefHeading___Toc2002_2241325158"/>
       <w:bookmarkEnd w:id="15"/>
       <w:r>
         <w:rPr>
@@ -5529,7 +5529,7 @@
         <w:pStyle w:val="Heading2"/>
         <w:rPr/>
       </w:pPr>
-      <w:bookmarkStart w:id="16" w:name="__RefHeading___Toc8910_1360963153"/>
+      <w:bookmarkStart w:id="16" w:name="__RefHeading___Toc2004_2241325158"/>
       <w:bookmarkEnd w:id="16"/>
       <w:r>
         <w:rPr>
@@ -6497,7 +6497,7 @@
         <w:pStyle w:val="Heading2"/>
         <w:rPr/>
       </w:pPr>
-      <w:bookmarkStart w:id="17" w:name="__RefHeading___Toc8912_1360963153"/>
+      <w:bookmarkStart w:id="17" w:name="__RefHeading___Toc2006_2241325158"/>
       <w:bookmarkEnd w:id="17"/>
       <w:r>
         <w:rPr>
@@ -6571,7 +6571,7 @@
         <w:pStyle w:val="Heading2"/>
         <w:rPr/>
       </w:pPr>
-      <w:bookmarkStart w:id="18" w:name="__RefHeading___Toc8914_1360963153"/>
+      <w:bookmarkStart w:id="18" w:name="__RefHeading___Toc2008_2241325158"/>
       <w:bookmarkEnd w:id="18"/>
       <w:r>
         <w:rPr>
@@ -6629,7 +6629,7 @@
         <w:pStyle w:val="Heading1"/>
         <w:rPr/>
       </w:pPr>
-      <w:bookmarkStart w:id="19" w:name="__RefHeading___Toc8916_1360963153"/>
+      <w:bookmarkStart w:id="19" w:name="__RefHeading___Toc2010_2241325158"/>
       <w:bookmarkEnd w:id="19"/>
       <w:r>
         <w:rPr>
@@ -6646,7 +6646,7 @@
         <w:pStyle w:val="Heading2"/>
         <w:rPr/>
       </w:pPr>
-      <w:bookmarkStart w:id="20" w:name="__RefHeading___Toc8918_1360963153"/>
+      <w:bookmarkStart w:id="20" w:name="__RefHeading___Toc2012_2241325158"/>
       <w:bookmarkEnd w:id="20"/>
       <w:r>
         <w:rPr>
@@ -6678,7 +6678,7 @@
         <w:pStyle w:val="Heading2"/>
         <w:rPr/>
       </w:pPr>
-      <w:bookmarkStart w:id="21" w:name="__RefHeading___Toc8920_1360963153"/>
+      <w:bookmarkStart w:id="21" w:name="__RefHeading___Toc2014_2241325158"/>
       <w:bookmarkEnd w:id="21"/>
       <w:r>
         <w:rPr>
@@ -6733,7 +6733,7 @@
         <w:pStyle w:val="Heading2"/>
         <w:rPr/>
       </w:pPr>
-      <w:bookmarkStart w:id="22" w:name="__RefHeading___Toc8922_1360963153"/>
+      <w:bookmarkStart w:id="22" w:name="__RefHeading___Toc2016_2241325158"/>
       <w:bookmarkEnd w:id="22"/>
       <w:r>
         <w:rPr>
@@ -6826,7 +6826,7 @@
         <w:pStyle w:val="Heading2"/>
         <w:rPr/>
       </w:pPr>
-      <w:bookmarkStart w:id="23" w:name="__RefHeading___Toc8924_1360963153"/>
+      <w:bookmarkStart w:id="23" w:name="__RefHeading___Toc2018_2241325158"/>
       <w:bookmarkEnd w:id="23"/>
       <w:r>
         <w:rPr>
@@ -6919,7 +6919,7 @@
         <w:pStyle w:val="Heading2"/>
         <w:rPr/>
       </w:pPr>
-      <w:bookmarkStart w:id="24" w:name="__RefHeading___Toc8926_1360963153"/>
+      <w:bookmarkStart w:id="24" w:name="__RefHeading___Toc2020_2241325158"/>
       <w:bookmarkEnd w:id="24"/>
       <w:r>
         <w:rPr>
@@ -7545,7 +7545,7 @@
         <w:pStyle w:val="Heading2"/>
         <w:rPr/>
       </w:pPr>
-      <w:bookmarkStart w:id="25" w:name="__RefHeading___Toc8928_1360963153"/>
+      <w:bookmarkStart w:id="25" w:name="__RefHeading___Toc2022_2241325158"/>
       <w:bookmarkEnd w:id="25"/>
       <w:r>
         <w:rPr>
@@ -7600,7 +7600,7 @@
         <w:pStyle w:val="Heading2"/>
         <w:rPr/>
       </w:pPr>
-      <w:bookmarkStart w:id="26" w:name="__RefHeading___Toc8930_1360963153"/>
+      <w:bookmarkStart w:id="26" w:name="__RefHeading___Toc2024_2241325158"/>
       <w:bookmarkEnd w:id="26"/>
       <w:r>
         <w:rPr>
@@ -7658,7 +7658,7 @@
         <w:pStyle w:val="Heading1"/>
         <w:rPr/>
       </w:pPr>
-      <w:bookmarkStart w:id="27" w:name="__RefHeading___Toc8932_1360963153"/>
+      <w:bookmarkStart w:id="27" w:name="__RefHeading___Toc2026_2241325158"/>
       <w:bookmarkEnd w:id="27"/>
       <w:r>
         <w:rPr>
@@ -7675,7 +7675,7 @@
         <w:pStyle w:val="Heading2"/>
         <w:rPr/>
       </w:pPr>
-      <w:bookmarkStart w:id="28" w:name="__RefHeading___Toc8934_1360963153"/>
+      <w:bookmarkStart w:id="28" w:name="__RefHeading___Toc2028_2241325158"/>
       <w:bookmarkEnd w:id="28"/>
       <w:r>
         <w:rPr>
@@ -7707,7 +7707,7 @@
         <w:pStyle w:val="Heading2"/>
         <w:rPr/>
       </w:pPr>
-      <w:bookmarkStart w:id="29" w:name="__RefHeading___Toc8936_1360963153"/>
+      <w:bookmarkStart w:id="29" w:name="__RefHeading___Toc2030_2241325158"/>
       <w:bookmarkEnd w:id="29"/>
       <w:r>
         <w:rPr>
@@ -7781,7 +7781,7 @@
         <w:pStyle w:val="Heading2"/>
         <w:rPr/>
       </w:pPr>
-      <w:bookmarkStart w:id="30" w:name="__RefHeading___Toc8938_1360963153"/>
+      <w:bookmarkStart w:id="30" w:name="__RefHeading___Toc2032_2241325158"/>
       <w:bookmarkEnd w:id="30"/>
       <w:r>
         <w:rPr>
@@ -8696,7 +8696,7 @@
         <w:pStyle w:val="Heading2"/>
         <w:rPr/>
       </w:pPr>
-      <w:bookmarkStart w:id="31" w:name="__RefHeading___Toc8940_1360963153"/>
+      <w:bookmarkStart w:id="31" w:name="__RefHeading___Toc2034_2241325158"/>
       <w:bookmarkEnd w:id="31"/>
       <w:r>
         <w:rPr>
@@ -8789,7 +8789,7 @@
         <w:pStyle w:val="Heading2"/>
         <w:rPr/>
       </w:pPr>
-      <w:bookmarkStart w:id="32" w:name="__RefHeading___Toc8942_1360963153"/>
+      <w:bookmarkStart w:id="32" w:name="__RefHeading___Toc2036_2241325158"/>
       <w:bookmarkEnd w:id="32"/>
       <w:r>
         <w:rPr>
@@ -9415,7 +9415,7 @@
         <w:pStyle w:val="Heading2"/>
         <w:rPr/>
       </w:pPr>
-      <w:bookmarkStart w:id="33" w:name="__RefHeading___Toc8944_1360963153"/>
+      <w:bookmarkStart w:id="33" w:name="__RefHeading___Toc2038_2241325158"/>
       <w:bookmarkEnd w:id="33"/>
       <w:r>
         <w:rPr>
@@ -9489,7 +9489,7 @@
         <w:pStyle w:val="Heading2"/>
         <w:rPr/>
       </w:pPr>
-      <w:bookmarkStart w:id="34" w:name="__RefHeading___Toc8946_1360963153"/>
+      <w:bookmarkStart w:id="34" w:name="__RefHeading___Toc2040_2241325158"/>
       <w:bookmarkEnd w:id="34"/>
       <w:r>
         <w:rPr>
@@ -9564,7 +9564,7 @@
         <w:pStyle w:val="Heading1"/>
         <w:rPr/>
       </w:pPr>
-      <w:bookmarkStart w:id="35" w:name="__RefHeading___Toc8948_1360963153"/>
+      <w:bookmarkStart w:id="35" w:name="__RefHeading___Toc2042_2241325158"/>
       <w:bookmarkEnd w:id="35"/>
       <w:r>
         <w:rPr>
@@ -9581,7 +9581,7 @@
         <w:pStyle w:val="Heading2"/>
         <w:rPr/>
       </w:pPr>
-      <w:bookmarkStart w:id="36" w:name="__RefHeading___Toc8950_1360963153"/>
+      <w:bookmarkStart w:id="36" w:name="__RefHeading___Toc2044_2241325158"/>
       <w:bookmarkEnd w:id="36"/>
       <w:r>
         <w:rPr>
@@ -9613,7 +9613,7 @@
         <w:pStyle w:val="Heading2"/>
         <w:rPr/>
       </w:pPr>
-      <w:bookmarkStart w:id="37" w:name="__RefHeading___Toc8952_1360963153"/>
+      <w:bookmarkStart w:id="37" w:name="__RefHeading___Toc2046_2241325158"/>
       <w:bookmarkEnd w:id="37"/>
       <w:r>
         <w:rPr>
@@ -9687,7 +9687,7 @@
         <w:pStyle w:val="Heading2"/>
         <w:rPr/>
       </w:pPr>
-      <w:bookmarkStart w:id="38" w:name="__RefHeading___Toc8954_1360963153"/>
+      <w:bookmarkStart w:id="38" w:name="__RefHeading___Toc2048_2241325158"/>
       <w:bookmarkEnd w:id="38"/>
       <w:r>
         <w:rPr>
@@ -9780,7 +9780,7 @@
         <w:pStyle w:val="Heading2"/>
         <w:rPr/>
       </w:pPr>
-      <w:bookmarkStart w:id="39" w:name="__RefHeading___Toc8956_1360963153"/>
+      <w:bookmarkStart w:id="39" w:name="__RefHeading___Toc2050_2241325158"/>
       <w:bookmarkEnd w:id="39"/>
       <w:r>
         <w:rPr>
@@ -9873,7 +9873,7 @@
         <w:pStyle w:val="Heading2"/>
         <w:rPr/>
       </w:pPr>
-      <w:bookmarkStart w:id="40" w:name="__RefHeading___Toc8958_1360963153"/>
+      <w:bookmarkStart w:id="40" w:name="__RefHeading___Toc2052_2241325158"/>
       <w:bookmarkEnd w:id="40"/>
       <w:r>
         <w:rPr>
@@ -10099,7 +10099,7 @@
                 <w:szCs w:val="24"/>
                 <w:lang w:val="en-US" w:eastAsia="ja-JP" w:bidi="ar-SA"/>
               </w:rPr>
-              <w:t>497 test cases, 634 automated business-rule tests, 371-step end-to-end cycle</w:t>
+              <w:t>629 test cases, 1,113 automated backend tests and 175 front-end tests, 433-step end-to-end cycle and 52-check go-live rehearsal on the final code</w:t>
             </w:r>
           </w:p>
         </w:tc>
@@ -10499,7 +10499,7 @@
         <w:pStyle w:val="Heading2"/>
         <w:rPr/>
       </w:pPr>
-      <w:bookmarkStart w:id="41" w:name="__RefHeading___Toc8960_1360963153"/>
+      <w:bookmarkStart w:id="41" w:name="__RefHeading___Toc2054_2241325158"/>
       <w:bookmarkEnd w:id="41"/>
       <w:r>
         <w:rPr>
@@ -10573,7 +10573,7 @@
         <w:pStyle w:val="Heading2"/>
         <w:rPr/>
       </w:pPr>
-      <w:bookmarkStart w:id="42" w:name="__RefHeading___Toc8962_1360963153"/>
+      <w:bookmarkStart w:id="42" w:name="__RefHeading___Toc2056_2241325158"/>
       <w:bookmarkEnd w:id="42"/>
       <w:r>
         <w:rPr>
@@ -10612,7 +10612,7 @@
         <w:pStyle w:val="Heading1"/>
         <w:rPr/>
       </w:pPr>
-      <w:bookmarkStart w:id="43" w:name="__RefHeading___Toc8964_1360963153"/>
+      <w:bookmarkStart w:id="43" w:name="__RefHeading___Toc2058_2241325158"/>
       <w:bookmarkEnd w:id="43"/>
       <w:r>
         <w:rPr>
@@ -11345,7 +11345,7 @@
       <w:r>
         <w:br w:type="page"/>
       </w:r>
-      <w:bookmarkStart w:id="44" w:name="__RefHeading___Toc8966_1360963153"/>
+      <w:bookmarkStart w:id="44" w:name="__RefHeading___Toc2060_2241325158"/>
       <w:bookmarkEnd w:id="44"/>
       <w:r>
         <w:rPr>
@@ -12078,7 +12078,7 @@
       <w:r>
         <w:br w:type="page"/>
       </w:r>
-      <w:bookmarkStart w:id="45" w:name="__RefHeading___Toc8968_1360963153"/>
+      <w:bookmarkStart w:id="45" w:name="__RefHeading___Toc2062_2241325158"/>
       <w:bookmarkEnd w:id="45"/>
       <w:r>
         <w:rPr>
@@ -12817,7 +12817,7 @@
       <w:r>
         <w:br w:type="page"/>
       </w:r>
-      <w:bookmarkStart w:id="46" w:name="__RefHeading___Toc8970_1360963153"/>
+      <w:bookmarkStart w:id="46" w:name="__RefHeading___Toc2064_2241325158"/>
       <w:bookmarkEnd w:id="46"/>
       <w:r>
         <w:rPr>
@@ -12866,7 +12866,7 @@
           <w:spacing w:val="0"/>
         </w:rPr>
       </w:pPr>
-      <w:bookmarkStart w:id="47" w:name="__RefHeading___Toc8972_1360963153"/>
+      <w:bookmarkStart w:id="47" w:name="__RefHeading___Toc2066_2241325158"/>
       <w:bookmarkStart w:id="48" w:name="_Toc233203395"/>
       <w:bookmarkEnd w:id="47"/>
       <w:r>

</xml_diff>